<commit_message>
Rút gọn comment và tô đỏ phần chỉnh sửa trong hợp đồng CTV
- Comment trong bản gốc rút ngắn còn 1 câu/vấn đề, dễ đọc hơn.
- Bản chỉnh sửa: chữ đỏ đánh dấu nội dung mới bổ sung/đã sửa, chữ đen
  giữ nguyên như bản gốc, có chú thích ở cuối file.

Co-Authored-By: Claude Sonnet 5 <noreply@anthropic.com>
Claude-Session: https://claude.ai/code/session_01YcJaeSSzExyX7psFDDcVZp
</commit_message>
<xml_diff>
--- a/2. Giấy tờ, chứng từ/Hợp đồng CTV/Hop dong CTV - Ban da chinh sua (de xuat).docx
+++ b/2. Giấy tờ, chứng từ/Hợp đồng CTV/Hop dong CTV - Ban da chinh sua (de xuat).docx
@@ -143,6 +143,7 @@
       <w:r>
         <w:rPr>
           <w:rFonts w:ascii="Times New Roman" w:cs="Times New Roman" w:eastAsia="Times New Roman" w:hAnsi="Times New Roman"/>
+          <w:color w:val="C00000"/>
           <w:sz w:val="28"/>
           <w:szCs w:val="28"/>
         </w:rPr>
@@ -173,6 +174,7 @@
       <w:r>
         <w:rPr>
           <w:rFonts w:ascii="Times New Roman" w:cs="Times New Roman" w:eastAsia="Times New Roman" w:hAnsi="Times New Roman"/>
+          <w:color w:val="C00000"/>
           <w:sz w:val="28"/>
           <w:szCs w:val="28"/>
         </w:rPr>
@@ -201,6 +203,7 @@
       <w:r>
         <w:rPr>
           <w:rFonts w:ascii="Times New Roman" w:cs="Times New Roman" w:eastAsia="Times New Roman" w:hAnsi="Times New Roman"/>
+          <w:color w:val="C00000"/>
           <w:sz w:val="28"/>
           <w:szCs w:val="28"/>
         </w:rPr>
@@ -232,7 +235,24 @@
           <w:sz w:val="28"/>
           <w:szCs w:val="28"/>
         </w:rPr>
-        <w:t xml:space="preserve">Hợp đồng cộng tác viên này (sau đây gọi là “Hợp đồng”) là hợp đồng dịch vụ theo quy định tại Bộ luật Dân sự 2015, không phải là hợp đồng lao động theo Bộ luật Lao động 2019, được ký kết tại văn phòng Công ty TNHH Dược Khoa Xanh, bởi các bên:</w:t>
+        <w:t xml:space="preserve">Hợp đồng cộng tác viên này (sau đây gọi là “Hợp đồng”) </w:t>
+      </w:r>
+      <w:r>
+        <w:rPr>
+          <w:rFonts w:ascii="Times New Roman" w:cs="Times New Roman" w:eastAsia="Times New Roman" w:hAnsi="Times New Roman"/>
+          <w:color w:val="C00000"/>
+          <w:sz w:val="28"/>
+          <w:szCs w:val="28"/>
+        </w:rPr>
+        <w:t xml:space="preserve">là hợp đồng dịch vụ theo quy định tại Bộ luật Dân sự 2015, không phải là hợp đồng lao động theo Bộ luật Lao động 2019, </w:t>
+      </w:r>
+      <w:r>
+        <w:rPr>
+          <w:rFonts w:ascii="Times New Roman" w:cs="Times New Roman" w:eastAsia="Times New Roman" w:hAnsi="Times New Roman"/>
+          <w:sz w:val="28"/>
+          <w:szCs w:val="28"/>
+        </w:rPr>
+        <w:t xml:space="preserve">được ký kết tại văn phòng Công ty TNHH Dược Khoa Xanh, bởi các bên:</w:t>
       </w:r>
     </w:p>
     <w:p>
@@ -267,9 +287,6 @@
     </w:p>
     <w:p>
       <w:pPr>
-        <w:tabs>
-          <w:tab w:val="left" w:pos="5000"/>
-        </w:tabs>
         <w:spacing w:after="120"/>
         <w:jc w:val="both"/>
       </w:pPr>
@@ -335,7 +352,24 @@
           <w:sz w:val="28"/>
           <w:szCs w:val="28"/>
         </w:rPr>
-        <w:t xml:space="preserve">(Sau đây gọi là “Bên A” hoặc “bên sử dụng dịch vụ”)</w:t>
+        <w:t xml:space="preserve">(Sau đây gọi là </w:t>
+      </w:r>
+      <w:r>
+        <w:rPr>
+          <w:rFonts w:ascii="Times New Roman" w:cs="Times New Roman" w:eastAsia="Times New Roman" w:hAnsi="Times New Roman"/>
+          <w:color w:val="C00000"/>
+          <w:sz w:val="28"/>
+          <w:szCs w:val="28"/>
+        </w:rPr>
+        <w:t xml:space="preserve">“Bên A” hoặc </w:t>
+      </w:r>
+      <w:r>
+        <w:rPr>
+          <w:rFonts w:ascii="Times New Roman" w:cs="Times New Roman" w:eastAsia="Times New Roman" w:hAnsi="Times New Roman"/>
+          <w:sz w:val="28"/>
+          <w:szCs w:val="28"/>
+        </w:rPr>
+        <w:t xml:space="preserve">“bên sử dụng dịch vụ”)</w:t>
       </w:r>
     </w:p>
     <w:p>
@@ -432,6 +466,7 @@
       <w:r>
         <w:rPr>
           <w:rFonts w:ascii="Times New Roman" w:cs="Times New Roman" w:eastAsia="Times New Roman" w:hAnsi="Times New Roman"/>
+          <w:color w:val="C00000"/>
           <w:sz w:val="28"/>
           <w:szCs w:val="28"/>
         </w:rPr>
@@ -446,6 +481,7 @@
       <w:r>
         <w:rPr>
           <w:rFonts w:ascii="Times New Roman" w:cs="Times New Roman" w:eastAsia="Times New Roman" w:hAnsi="Times New Roman"/>
+          <w:color w:val="C00000"/>
           <w:sz w:val="28"/>
           <w:szCs w:val="28"/>
         </w:rPr>
@@ -463,7 +499,24 @@
           <w:sz w:val="28"/>
           <w:szCs w:val="28"/>
         </w:rPr>
-        <w:t xml:space="preserve">(Sau đây gọi là “Bên B” hoặc “Cộng tác viên”)</w:t>
+        <w:t xml:space="preserve">(Sau đây gọi là </w:t>
+      </w:r>
+      <w:r>
+        <w:rPr>
+          <w:rFonts w:ascii="Times New Roman" w:cs="Times New Roman" w:eastAsia="Times New Roman" w:hAnsi="Times New Roman"/>
+          <w:color w:val="C00000"/>
+          <w:sz w:val="28"/>
+          <w:szCs w:val="28"/>
+        </w:rPr>
+        <w:t xml:space="preserve">“Bên B” hoặc </w:t>
+      </w:r>
+      <w:r>
+        <w:rPr>
+          <w:rFonts w:ascii="Times New Roman" w:cs="Times New Roman" w:eastAsia="Times New Roman" w:hAnsi="Times New Roman"/>
+          <w:sz w:val="28"/>
+          <w:szCs w:val="28"/>
+        </w:rPr>
+        <w:t xml:space="preserve">“Cộng tác viên”)</w:t>
       </w:r>
     </w:p>
     <w:p>
@@ -488,8 +541,7 @@
       <w:r>
         <w:rPr>
           <w:rFonts w:ascii="Times New Roman" w:cs="Times New Roman" w:eastAsia="Times New Roman" w:hAnsi="Times New Roman"/>
-          <w:b/>
-          <w:bCs/>
+          <w:color w:val="C00000"/>
           <w:sz w:val="28"/>
           <w:szCs w:val="28"/>
         </w:rPr>
@@ -504,6 +556,7 @@
       <w:r>
         <w:rPr>
           <w:rFonts w:ascii="Times New Roman" w:cs="Times New Roman" w:eastAsia="Times New Roman" w:hAnsi="Times New Roman"/>
+          <w:color w:val="C00000"/>
           <w:sz w:val="28"/>
           <w:szCs w:val="28"/>
         </w:rPr>
@@ -635,6 +688,7 @@
       <w:r>
         <w:rPr>
           <w:rFonts w:ascii="Times New Roman" w:cs="Times New Roman" w:eastAsia="Times New Roman" w:hAnsi="Times New Roman"/>
+          <w:color w:val="C00000"/>
           <w:sz w:val="28"/>
           <w:szCs w:val="28"/>
         </w:rPr>
@@ -649,8 +703,6 @@
       <w:r>
         <w:rPr>
           <w:rFonts w:ascii="Times New Roman" w:cs="Times New Roman" w:eastAsia="Times New Roman" w:hAnsi="Times New Roman"/>
-          <w:b/>
-          <w:bCs/>
           <w:sz w:val="28"/>
           <w:szCs w:val="28"/>
         </w:rPr>
@@ -712,7 +764,7 @@
           <w:sz w:val="28"/>
           <w:szCs w:val="28"/>
         </w:rPr>
-        <w:t xml:space="preserve">2. Điều kiện thanh toán (đơn hàng hợp lệ):</w:t>
+        <w:t xml:space="preserve">2. Điều kiện thanh toán:</w:t>
       </w:r>
     </w:p>
     <w:p>
@@ -754,6 +806,7 @@
       <w:r>
         <w:rPr>
           <w:rFonts w:ascii="Times New Roman" w:cs="Times New Roman" w:eastAsia="Times New Roman" w:hAnsi="Times New Roman"/>
+          <w:color w:val="C00000"/>
           <w:sz w:val="28"/>
           <w:szCs w:val="28"/>
         </w:rPr>
@@ -813,6 +866,7 @@
       <w:r>
         <w:rPr>
           <w:rFonts w:ascii="Times New Roman" w:cs="Times New Roman" w:eastAsia="Times New Roman" w:hAnsi="Times New Roman"/>
+          <w:color w:val="C00000"/>
           <w:sz w:val="28"/>
           <w:szCs w:val="28"/>
         </w:rPr>
@@ -860,18 +914,28 @@
           <w:sz w:val="28"/>
           <w:szCs w:val="28"/>
         </w:rPr>
-        <w:t xml:space="preserve">- Bên A có trách nhiệm khấu trừ thuế TNCN trước khi chi trả cho Bên B theo quy định của pháp luật thuế hiện hành; cụ thể, khấu trừ 10% trên tổng thu nhập trả cho Bên B đối với mỗi lần chi trả từ 2.000.000 đồng trở lên, theo điểm i khoản 1 Điều 25 Thông tư số 111/2013/TT-BTC, trừ trường hợp Bên B đủ điều kiện và có văn bản cam kết theo Mẫu 08/CK-TNCN (hoặc mẫu tương đương do cơ quan thuế quy định tại từng thời điểm) gửi Bên A để tạm thời không khấu trừ thuế.</w:t>
-      </w:r>
-    </w:p>
-    <w:p>
-      <w:pPr>
-        <w:spacing w:after="120"/>
-        <w:ind w:left="400"/>
-        <w:jc w:val="both"/>
-      </w:pPr>
-      <w:r>
-        <w:rPr>
-          <w:rFonts w:ascii="Times New Roman" w:cs="Times New Roman" w:eastAsia="Times New Roman" w:hAnsi="Times New Roman"/>
+        <w:t xml:space="preserve">- </w:t>
+      </w:r>
+      <w:r>
+        <w:rPr>
+          <w:rFonts w:ascii="Times New Roman" w:cs="Times New Roman" w:eastAsia="Times New Roman" w:hAnsi="Times New Roman"/>
+          <w:color w:val="C00000"/>
+          <w:sz w:val="28"/>
+          <w:szCs w:val="28"/>
+        </w:rPr>
+        <w:t xml:space="preserve">Bên A có trách nhiệm khấu trừ thuế TNCN trước khi chi trả cho Bên B theo quy định của pháp luật thuế hiện hành; cụ thể, khấu trừ 10% trên tổng thu nhập trả cho Bên B đối với mỗi lần chi trả từ 2.000.000 đồng trở lên, theo điểm i khoản 1 Điều 25 Thông tư số 111/2013/TT-BTC, trừ trường hợp Bên B đủ điều kiện và có văn bản cam kết theo Mẫu 08/CK-TNCN (hoặc mẫu tương đương do cơ quan thuế quy định tại từng thời điểm) gửi Bên A để tạm thời không khấu trừ thuế.</w:t>
+      </w:r>
+    </w:p>
+    <w:p>
+      <w:pPr>
+        <w:spacing w:after="120"/>
+        <w:ind w:left="400"/>
+        <w:jc w:val="both"/>
+      </w:pPr>
+      <w:r>
+        <w:rPr>
+          <w:rFonts w:ascii="Times New Roman" w:cs="Times New Roman" w:eastAsia="Times New Roman" w:hAnsi="Times New Roman"/>
+          <w:color w:val="C00000"/>
           <w:sz w:val="28"/>
           <w:szCs w:val="28"/>
         </w:rPr>
@@ -886,8 +950,7 @@
       <w:r>
         <w:rPr>
           <w:rFonts w:ascii="Times New Roman" w:cs="Times New Roman" w:eastAsia="Times New Roman" w:hAnsi="Times New Roman"/>
-          <w:b/>
-          <w:bCs/>
+          <w:color w:val="C00000"/>
           <w:sz w:val="28"/>
           <w:szCs w:val="28"/>
         </w:rPr>
@@ -1051,6 +1114,7 @@
       <w:r>
         <w:rPr>
           <w:rFonts w:ascii="Times New Roman" w:cs="Times New Roman" w:eastAsia="Times New Roman" w:hAnsi="Times New Roman"/>
+          <w:color w:val="C00000"/>
           <w:sz w:val="28"/>
           <w:szCs w:val="28"/>
         </w:rPr>
@@ -1139,8 +1203,7 @@
       <w:r>
         <w:rPr>
           <w:rFonts w:ascii="Times New Roman" w:cs="Times New Roman" w:eastAsia="Times New Roman" w:hAnsi="Times New Roman"/>
-          <w:b/>
-          <w:bCs/>
+          <w:color w:val="C00000"/>
           <w:sz w:val="28"/>
           <w:szCs w:val="28"/>
         </w:rPr>
@@ -1170,6 +1233,7 @@
       <w:r>
         <w:rPr>
           <w:rFonts w:ascii="Times New Roman" w:cs="Times New Roman" w:eastAsia="Times New Roman" w:hAnsi="Times New Roman"/>
+          <w:color w:val="C00000"/>
           <w:sz w:val="28"/>
           <w:szCs w:val="28"/>
         </w:rPr>
@@ -1203,7 +1267,24 @@
           <w:sz w:val="28"/>
           <w:szCs w:val="28"/>
         </w:rPr>
-        <w:t xml:space="preserve">- Yêu cầu Bên B bồi thường thiệt hại theo Điều 6 của Hợp đồng này nếu Bên B tư vấn sai sự thật, làm mất uy tín thương hiệu của Bên A hoặc tiết lộ bí mật kinh doanh.</w:t>
+        <w:t xml:space="preserve">- Yêu cầu Bên B bồi thường thiệt hại </w:t>
+      </w:r>
+      <w:r>
+        <w:rPr>
+          <w:rFonts w:ascii="Times New Roman" w:cs="Times New Roman" w:eastAsia="Times New Roman" w:hAnsi="Times New Roman"/>
+          <w:color w:val="C00000"/>
+          <w:sz w:val="28"/>
+          <w:szCs w:val="28"/>
+        </w:rPr>
+        <w:t xml:space="preserve">theo Điều 6 của Hợp đồng này </w:t>
+      </w:r>
+      <w:r>
+        <w:rPr>
+          <w:rFonts w:ascii="Times New Roman" w:cs="Times New Roman" w:eastAsia="Times New Roman" w:hAnsi="Times New Roman"/>
+          <w:sz w:val="28"/>
+          <w:szCs w:val="28"/>
+        </w:rPr>
+        <w:t xml:space="preserve">nếu Bên B tư vấn sai sự thật, làm mất uy tín thương hiệu của Bên A hoặc tiết lộ bí mật kinh doanh.</w:t>
       </w:r>
     </w:p>
     <w:p>
@@ -1233,7 +1314,24 @@
           <w:sz w:val="28"/>
           <w:szCs w:val="28"/>
         </w:rPr>
-        <w:t xml:space="preserve">- Đơn phương chấm dứt Hợp đồng theo Điều 7 và yêu cầu bồi thường thiệt hại nếu Bên B vi phạm nghiêm trọng nghĩa vụ.</w:t>
+        <w:t xml:space="preserve">- Đơn phương chấm dứt Hợp đồng </w:t>
+      </w:r>
+      <w:r>
+        <w:rPr>
+          <w:rFonts w:ascii="Times New Roman" w:cs="Times New Roman" w:eastAsia="Times New Roman" w:hAnsi="Times New Roman"/>
+          <w:color w:val="C00000"/>
+          <w:sz w:val="28"/>
+          <w:szCs w:val="28"/>
+        </w:rPr>
+        <w:t xml:space="preserve">theo Điều 7 </w:t>
+      </w:r>
+      <w:r>
+        <w:rPr>
+          <w:rFonts w:ascii="Times New Roman" w:cs="Times New Roman" w:eastAsia="Times New Roman" w:hAnsi="Times New Roman"/>
+          <w:sz w:val="28"/>
+          <w:szCs w:val="28"/>
+        </w:rPr>
+        <w:t xml:space="preserve">và yêu cầu bồi thường thiệt hại nếu Bên B vi phạm nghiêm trọng nghĩa vụ.</w:t>
       </w:r>
     </w:p>
     <w:p>
@@ -1307,22 +1405,40 @@
           <w:sz w:val="28"/>
           <w:szCs w:val="28"/>
         </w:rPr>
-        <w:t xml:space="preserve">- Đối soát và thanh toán đầy đủ, đúng hạn Phí dịch vụ (hoa hồng) cho Bên B theo Điều 2; chịu trách nhiệm trả lãi chậm trả nếu vi phạm thời hạn thanh toán.</w:t>
-      </w:r>
-    </w:p>
-    <w:p>
-      <w:pPr>
-        <w:spacing w:after="120"/>
-        <w:ind w:left="400"/>
-        <w:jc w:val="both"/>
-      </w:pPr>
-      <w:r>
-        <w:rPr>
-          <w:rFonts w:ascii="Times New Roman" w:cs="Times New Roman" w:eastAsia="Times New Roman" w:hAnsi="Times New Roman"/>
-          <w:sz w:val="28"/>
-          <w:szCs w:val="28"/>
-        </w:rPr>
-        <w:t xml:space="preserve">- Khấu trừ và nộp Thuế TNCN thay cho Bên B theo đúng quy định pháp luật; cấp Chứng từ khấu trừ thuế khi Bên B yêu cầu.</w:t>
+        <w:t xml:space="preserve">- Đối soát và thanh toán đầy đủ, đúng hạn Phí dịch vụ (hoa hồng) cho Bên B theo Điều 2; </w:t>
+      </w:r>
+      <w:r>
+        <w:rPr>
+          <w:rFonts w:ascii="Times New Roman" w:cs="Times New Roman" w:eastAsia="Times New Roman" w:hAnsi="Times New Roman"/>
+          <w:color w:val="C00000"/>
+          <w:sz w:val="28"/>
+          <w:szCs w:val="28"/>
+        </w:rPr>
+        <w:t xml:space="preserve">chịu trách nhiệm trả lãi chậm trả nếu vi phạm thời hạn thanh toán.</w:t>
+      </w:r>
+    </w:p>
+    <w:p>
+      <w:pPr>
+        <w:spacing w:after="120"/>
+        <w:ind w:left="400"/>
+        <w:jc w:val="both"/>
+      </w:pPr>
+      <w:r>
+        <w:rPr>
+          <w:rFonts w:ascii="Times New Roman" w:cs="Times New Roman" w:eastAsia="Times New Roman" w:hAnsi="Times New Roman"/>
+          <w:sz w:val="28"/>
+          <w:szCs w:val="28"/>
+        </w:rPr>
+        <w:t xml:space="preserve">- Khấu trừ và nộp Thuế TNCN thay cho Bên B theo đúng quy định pháp luật; </w:t>
+      </w:r>
+      <w:r>
+        <w:rPr>
+          <w:rFonts w:ascii="Times New Roman" w:cs="Times New Roman" w:eastAsia="Times New Roman" w:hAnsi="Times New Roman"/>
+          <w:color w:val="C00000"/>
+          <w:sz w:val="28"/>
+          <w:szCs w:val="28"/>
+        </w:rPr>
+        <w:t xml:space="preserve">cấp Chứng từ khấu trừ thuế khi Bên B yêu cầu.</w:t>
       </w:r>
     </w:p>
     <w:p>
@@ -1333,8 +1449,7 @@
       <w:r>
         <w:rPr>
           <w:rFonts w:ascii="Times New Roman" w:cs="Times New Roman" w:eastAsia="Times New Roman" w:hAnsi="Times New Roman"/>
-          <w:b/>
-          <w:bCs/>
+          <w:color w:val="C00000"/>
           <w:sz w:val="28"/>
           <w:szCs w:val="28"/>
         </w:rPr>
@@ -1349,6 +1464,7 @@
       <w:r>
         <w:rPr>
           <w:rFonts w:ascii="Times New Roman" w:cs="Times New Roman" w:eastAsia="Times New Roman" w:hAnsi="Times New Roman"/>
+          <w:color w:val="C00000"/>
           <w:sz w:val="28"/>
           <w:szCs w:val="28"/>
         </w:rPr>
@@ -1363,6 +1479,7 @@
       <w:r>
         <w:rPr>
           <w:rFonts w:ascii="Times New Roman" w:cs="Times New Roman" w:eastAsia="Times New Roman" w:hAnsi="Times New Roman"/>
+          <w:color w:val="C00000"/>
           <w:sz w:val="28"/>
           <w:szCs w:val="28"/>
         </w:rPr>
@@ -1377,6 +1494,7 @@
       <w:r>
         <w:rPr>
           <w:rFonts w:ascii="Times New Roman" w:cs="Times New Roman" w:eastAsia="Times New Roman" w:hAnsi="Times New Roman"/>
+          <w:color w:val="C00000"/>
           <w:sz w:val="28"/>
           <w:szCs w:val="28"/>
         </w:rPr>
@@ -1391,8 +1509,7 @@
       <w:r>
         <w:rPr>
           <w:rFonts w:ascii="Times New Roman" w:cs="Times New Roman" w:eastAsia="Times New Roman" w:hAnsi="Times New Roman"/>
-          <w:b/>
-          <w:bCs/>
+          <w:color w:val="C00000"/>
           <w:sz w:val="28"/>
           <w:szCs w:val="28"/>
         </w:rPr>
@@ -1407,6 +1524,7 @@
       <w:r>
         <w:rPr>
           <w:rFonts w:ascii="Times New Roman" w:cs="Times New Roman" w:eastAsia="Times New Roman" w:hAnsi="Times New Roman"/>
+          <w:color w:val="C00000"/>
           <w:sz w:val="28"/>
           <w:szCs w:val="28"/>
         </w:rPr>
@@ -1421,6 +1539,7 @@
       <w:r>
         <w:rPr>
           <w:rFonts w:ascii="Times New Roman" w:cs="Times New Roman" w:eastAsia="Times New Roman" w:hAnsi="Times New Roman"/>
+          <w:color w:val="C00000"/>
           <w:sz w:val="28"/>
           <w:szCs w:val="28"/>
         </w:rPr>
@@ -1435,8 +1554,6 @@
       <w:r>
         <w:rPr>
           <w:rFonts w:ascii="Times New Roman" w:cs="Times New Roman" w:eastAsia="Times New Roman" w:hAnsi="Times New Roman"/>
-          <w:b/>
-          <w:bCs/>
           <w:sz w:val="28"/>
           <w:szCs w:val="28"/>
         </w:rPr>
@@ -1466,6 +1583,7 @@
       <w:r>
         <w:rPr>
           <w:rFonts w:ascii="Times New Roman" w:cs="Times New Roman" w:eastAsia="Times New Roman" w:hAnsi="Times New Roman"/>
+          <w:color w:val="C00000"/>
           <w:sz w:val="28"/>
           <w:szCs w:val="28"/>
         </w:rPr>
@@ -1481,6 +1599,7 @@
       <w:r>
         <w:rPr>
           <w:rFonts w:ascii="Times New Roman" w:cs="Times New Roman" w:eastAsia="Times New Roman" w:hAnsi="Times New Roman"/>
+          <w:color w:val="C00000"/>
           <w:sz w:val="28"/>
           <w:szCs w:val="28"/>
         </w:rPr>
@@ -1496,6 +1615,7 @@
       <w:r>
         <w:rPr>
           <w:rFonts w:ascii="Times New Roman" w:cs="Times New Roman" w:eastAsia="Times New Roman" w:hAnsi="Times New Roman"/>
+          <w:color w:val="C00000"/>
           <w:sz w:val="28"/>
           <w:szCs w:val="28"/>
         </w:rPr>
@@ -1513,17 +1633,27 @@
           <w:sz w:val="28"/>
           <w:szCs w:val="28"/>
         </w:rPr>
-        <w:t xml:space="preserve">2. Thời hạn báo trước: Bên đơn phương chấm dứt Hợp đồng phải thông báo bằng văn bản cho bên còn lại ít nhất …… (đề xuất: 15) ngày làm việc trước ngày dự kiến chấm dứt.</w:t>
-      </w:r>
-    </w:p>
-    <w:p>
-      <w:pPr>
-        <w:spacing w:after="120"/>
-        <w:jc w:val="both"/>
-      </w:pPr>
-      <w:r>
-        <w:rPr>
-          <w:rFonts w:ascii="Times New Roman" w:cs="Times New Roman" w:eastAsia="Times New Roman" w:hAnsi="Times New Roman"/>
+        <w:t xml:space="preserve">2. </w:t>
+      </w:r>
+      <w:r>
+        <w:rPr>
+          <w:rFonts w:ascii="Times New Roman" w:cs="Times New Roman" w:eastAsia="Times New Roman" w:hAnsi="Times New Roman"/>
+          <w:color w:val="C00000"/>
+          <w:sz w:val="28"/>
+          <w:szCs w:val="28"/>
+        </w:rPr>
+        <w:t xml:space="preserve">Thời hạn báo trước: Bên đơn phương chấm dứt Hợp đồng phải thông báo bằng văn bản cho bên còn lại ít nhất …… (đề xuất: 15) ngày làm việc trước ngày dự kiến chấm dứt.</w:t>
+      </w:r>
+    </w:p>
+    <w:p>
+      <w:pPr>
+        <w:spacing w:after="120"/>
+        <w:jc w:val="both"/>
+      </w:pPr>
+      <w:r>
+        <w:rPr>
+          <w:rFonts w:ascii="Times New Roman" w:cs="Times New Roman" w:eastAsia="Times New Roman" w:hAnsi="Times New Roman"/>
+          <w:color w:val="C00000"/>
           <w:sz w:val="28"/>
           <w:szCs w:val="28"/>
         </w:rPr>
@@ -1538,6 +1668,7 @@
       <w:r>
         <w:rPr>
           <w:rFonts w:ascii="Times New Roman" w:cs="Times New Roman" w:eastAsia="Times New Roman" w:hAnsi="Times New Roman"/>
+          <w:color w:val="C00000"/>
           <w:sz w:val="28"/>
           <w:szCs w:val="28"/>
         </w:rPr>
@@ -1552,8 +1683,7 @@
       <w:r>
         <w:rPr>
           <w:rFonts w:ascii="Times New Roman" w:cs="Times New Roman" w:eastAsia="Times New Roman" w:hAnsi="Times New Roman"/>
-          <w:b/>
-          <w:bCs/>
+          <w:color w:val="C00000"/>
           <w:sz w:val="28"/>
           <w:szCs w:val="28"/>
         </w:rPr>
@@ -1568,6 +1698,7 @@
       <w:r>
         <w:rPr>
           <w:rFonts w:ascii="Times New Roman" w:cs="Times New Roman" w:eastAsia="Times New Roman" w:hAnsi="Times New Roman"/>
+          <w:color w:val="C00000"/>
           <w:sz w:val="28"/>
           <w:szCs w:val="28"/>
         </w:rPr>
@@ -1582,6 +1713,7 @@
       <w:r>
         <w:rPr>
           <w:rFonts w:ascii="Times New Roman" w:cs="Times New Roman" w:eastAsia="Times New Roman" w:hAnsi="Times New Roman"/>
+          <w:color w:val="C00000"/>
           <w:sz w:val="28"/>
           <w:szCs w:val="28"/>
         </w:rPr>
@@ -1596,8 +1728,7 @@
       <w:r>
         <w:rPr>
           <w:rFonts w:ascii="Times New Roman" w:cs="Times New Roman" w:eastAsia="Times New Roman" w:hAnsi="Times New Roman"/>
-          <w:b/>
-          <w:bCs/>
+          <w:color w:val="C00000"/>
           <w:sz w:val="28"/>
           <w:szCs w:val="28"/>
         </w:rPr>
@@ -1612,6 +1743,7 @@
       <w:r>
         <w:rPr>
           <w:rFonts w:ascii="Times New Roman" w:cs="Times New Roman" w:eastAsia="Times New Roman" w:hAnsi="Times New Roman"/>
+          <w:color w:val="C00000"/>
           <w:sz w:val="28"/>
           <w:szCs w:val="28"/>
         </w:rPr>
@@ -1626,6 +1758,7 @@
       <w:r>
         <w:rPr>
           <w:rFonts w:ascii="Times New Roman" w:cs="Times New Roman" w:eastAsia="Times New Roman" w:hAnsi="Times New Roman"/>
+          <w:color w:val="C00000"/>
           <w:sz w:val="28"/>
           <w:szCs w:val="28"/>
         </w:rPr>
@@ -1640,8 +1773,7 @@
       <w:r>
         <w:rPr>
           <w:rFonts w:ascii="Times New Roman" w:cs="Times New Roman" w:eastAsia="Times New Roman" w:hAnsi="Times New Roman"/>
-          <w:b/>
-          <w:bCs/>
+          <w:color w:val="C00000"/>
           <w:sz w:val="28"/>
           <w:szCs w:val="28"/>
         </w:rPr>
@@ -1701,7 +1833,66 @@
           <w:sz w:val="28"/>
           <w:szCs w:val="28"/>
         </w:rPr>
-        <w:t xml:space="preserve">4. Hợp đồng này được lập thành 02 (hai) bản, có giá trị pháp lý như nhau, mỗi Bên giữ 01 (một) bản để thực hiện (đề xuất; hai Bên xác nhận lại số bản cụ thể trước khi ký)./.</w:t>
+        <w:t xml:space="preserve">4. </w:t>
+      </w:r>
+      <w:r>
+        <w:rPr>
+          <w:rFonts w:ascii="Times New Roman" w:cs="Times New Roman" w:eastAsia="Times New Roman" w:hAnsi="Times New Roman"/>
+          <w:sz w:val="28"/>
+          <w:szCs w:val="28"/>
+        </w:rPr>
+        <w:t xml:space="preserve">Hợp đồng này được lập thành </w:t>
+      </w:r>
+      <w:r>
+        <w:rPr>
+          <w:rFonts w:ascii="Times New Roman" w:cs="Times New Roman" w:eastAsia="Times New Roman" w:hAnsi="Times New Roman"/>
+          <w:color w:val="C00000"/>
+          <w:sz w:val="28"/>
+          <w:szCs w:val="28"/>
+        </w:rPr>
+        <w:t xml:space="preserve">02 (hai)</w:t>
+      </w:r>
+      <w:r>
+        <w:rPr>
+          <w:rFonts w:ascii="Times New Roman" w:cs="Times New Roman" w:eastAsia="Times New Roman" w:hAnsi="Times New Roman"/>
+          <w:sz w:val="28"/>
+          <w:szCs w:val="28"/>
+        </w:rPr>
+        <w:t xml:space="preserve"> bản, có giá trị pháp lý như nhau, mỗi Bên giữ </w:t>
+      </w:r>
+      <w:r>
+        <w:rPr>
+          <w:rFonts w:ascii="Times New Roman" w:cs="Times New Roman" w:eastAsia="Times New Roman" w:hAnsi="Times New Roman"/>
+          <w:color w:val="C00000"/>
+          <w:sz w:val="28"/>
+          <w:szCs w:val="28"/>
+        </w:rPr>
+        <w:t xml:space="preserve">01 (một)</w:t>
+      </w:r>
+      <w:r>
+        <w:rPr>
+          <w:rFonts w:ascii="Times New Roman" w:cs="Times New Roman" w:eastAsia="Times New Roman" w:hAnsi="Times New Roman"/>
+          <w:sz w:val="28"/>
+          <w:szCs w:val="28"/>
+        </w:rPr>
+        <w:t xml:space="preserve"> bản để thực hiện </w:t>
+      </w:r>
+      <w:r>
+        <w:rPr>
+          <w:rFonts w:ascii="Times New Roman" w:cs="Times New Roman" w:eastAsia="Times New Roman" w:hAnsi="Times New Roman"/>
+          <w:color w:val="C00000"/>
+          <w:sz w:val="28"/>
+          <w:szCs w:val="28"/>
+        </w:rPr>
+        <w:t xml:space="preserve">(đề xuất; hai Bên xác nhận lại số bản cụ thể trước khi ký)</w:t>
+      </w:r>
+      <w:r>
+        <w:rPr>
+          <w:rFonts w:ascii="Times New Roman" w:cs="Times New Roman" w:eastAsia="Times New Roman" w:hAnsi="Times New Roman"/>
+          <w:sz w:val="28"/>
+          <w:szCs w:val="28"/>
+        </w:rPr>
+        <w:t xml:space="preserve">./.</w:t>
       </w:r>
     </w:p>
     <w:p>
@@ -1815,7 +2006,6 @@
         <w:pageBreakBefore/>
       </w:pPr>
       <w:r>
-        <w:br/>
         <w:t xml:space="preserve"/>
       </w:r>
     </w:p>
@@ -1862,21 +2052,47 @@
           <w:sz w:val="28"/>
           <w:szCs w:val="28"/>
         </w:rPr>
-        <w:t xml:space="preserve">(Kèm theo Hợp đồng Dịch vụ Cộng tác viên Số: ……/HĐCTV-DKX)</w:t>
-      </w:r>
-    </w:p>
-    <w:p>
-      <w:pPr>
-        <w:spacing w:after="120"/>
-        <w:jc w:val="both"/>
-      </w:pPr>
-      <w:r>
-        <w:rPr>
-          <w:rFonts w:ascii="Times New Roman" w:cs="Times New Roman" w:eastAsia="Times New Roman" w:hAnsi="Times New Roman"/>
-          <w:sz w:val="28"/>
-          <w:szCs w:val="28"/>
-        </w:rPr>
-        <w:t xml:space="preserve">Phụ lục này là một bộ phận không thể tách rời của Hợp đồng Dịch vụ Cộng tác viên Số: ……/HĐCTV-DKX ký ngày …… tháng …… năm …… giữa:</w:t>
+        <w:t xml:space="preserve">(Kèm theo Hợp đồng Dịch vụ Cộng tác viên Số: </w:t>
+      </w:r>
+      <w:r>
+        <w:rPr>
+          <w:rFonts w:ascii="Times New Roman" w:cs="Times New Roman" w:eastAsia="Times New Roman" w:hAnsi="Times New Roman"/>
+          <w:color w:val="C00000"/>
+          <w:sz w:val="28"/>
+          <w:szCs w:val="28"/>
+        </w:rPr>
+        <w:t xml:space="preserve">……/HĐCTV-DKX</w:t>
+      </w:r>
+      <w:r>
+        <w:rPr>
+          <w:rFonts w:ascii="Times New Roman" w:cs="Times New Roman" w:eastAsia="Times New Roman" w:hAnsi="Times New Roman"/>
+          <w:sz w:val="28"/>
+          <w:szCs w:val="28"/>
+        </w:rPr>
+        <w:t xml:space="preserve">)</w:t>
+      </w:r>
+    </w:p>
+    <w:p>
+      <w:pPr>
+        <w:spacing w:after="120"/>
+        <w:jc w:val="both"/>
+      </w:pPr>
+      <w:r>
+        <w:rPr>
+          <w:rFonts w:ascii="Times New Roman" w:cs="Times New Roman" w:eastAsia="Times New Roman" w:hAnsi="Times New Roman"/>
+          <w:sz w:val="28"/>
+          <w:szCs w:val="28"/>
+        </w:rPr>
+        <w:t xml:space="preserve">Phụ lục này là một bộ phận không thể tách rời của Hợp đồng Dịch vụ Cộng tác viên Số: </w:t>
+      </w:r>
+      <w:r>
+        <w:rPr>
+          <w:rFonts w:ascii="Times New Roman" w:cs="Times New Roman" w:eastAsia="Times New Roman" w:hAnsi="Times New Roman"/>
+          <w:color w:val="C00000"/>
+          <w:sz w:val="28"/>
+          <w:szCs w:val="28"/>
+        </w:rPr>
+        <w:t xml:space="preserve">……/HĐCTV-DKX ký ngày …… tháng …… năm …… giữa:</w:t>
       </w:r>
     </w:p>
     <w:p>
@@ -1947,10 +2163,19 @@
       <w:r>
         <w:rPr>
           <w:rFonts w:ascii="Times New Roman" w:cs="Times New Roman" w:eastAsia="Times New Roman" w:hAnsi="Times New Roman"/>
-          <w:sz w:val="28"/>
-          <w:szCs w:val="28"/>
-        </w:rPr>
-        <w:t xml:space="preserve">Phụ lục có hiệu lực cùng thời điểm với Hợp đồng chính. Hai Bên thống nhất quy định chi tiết mức hưởng Phí dịch vụ (% hoa hồng), điều kiện ghi nhận và phương thức chi trả đối với Cộng tác viên Kinh doanh như sau:</w:t>
+          <w:color w:val="C00000"/>
+          <w:sz w:val="28"/>
+          <w:szCs w:val="28"/>
+        </w:rPr>
+        <w:t xml:space="preserve">Phụ lục có hiệu lực cùng thời điểm với Hợp đồng chính. </w:t>
+      </w:r>
+      <w:r>
+        <w:rPr>
+          <w:rFonts w:ascii="Times New Roman" w:cs="Times New Roman" w:eastAsia="Times New Roman" w:hAnsi="Times New Roman"/>
+          <w:sz w:val="28"/>
+          <w:szCs w:val="28"/>
+        </w:rPr>
+        <w:t xml:space="preserve">Hai Bên thống nhất quy định chi tiết mức hưởng Phí dịch vụ (% hoa hồng), điều kiện ghi nhận và phương thức chi trả đối với Cộng tác viên Kinh doanh như sau:</w:t>
       </w:r>
     </w:p>
     <w:p>
@@ -1961,8 +2186,6 @@
       <w:r>
         <w:rPr>
           <w:rFonts w:ascii="Times New Roman" w:cs="Times New Roman" w:eastAsia="Times New Roman" w:hAnsi="Times New Roman"/>
-          <w:b/>
-          <w:bCs/>
           <w:sz w:val="28"/>
           <w:szCs w:val="28"/>
         </w:rPr>
@@ -2019,6 +2242,7 @@
       <w:r>
         <w:rPr>
           <w:rFonts w:ascii="Times New Roman" w:cs="Times New Roman" w:eastAsia="Times New Roman" w:hAnsi="Times New Roman"/>
+          <w:color w:val="C00000"/>
           <w:sz w:val="28"/>
           <w:szCs w:val="28"/>
         </w:rPr>
@@ -2033,8 +2257,6 @@
       <w:r>
         <w:rPr>
           <w:rFonts w:ascii="Times New Roman" w:cs="Times New Roman" w:eastAsia="Times New Roman" w:hAnsi="Times New Roman"/>
-          <w:b/>
-          <w:bCs/>
           <w:sz w:val="28"/>
           <w:szCs w:val="28"/>
         </w:rPr>
@@ -2049,6 +2271,7 @@
       <w:r>
         <w:rPr>
           <w:rFonts w:ascii="Times New Roman" w:cs="Times New Roman" w:eastAsia="Times New Roman" w:hAnsi="Times New Roman"/>
+          <w:color w:val="C00000"/>
           <w:sz w:val="28"/>
           <w:szCs w:val="28"/>
         </w:rPr>
@@ -2094,6 +2317,7 @@
       <w:r>
         <w:rPr>
           <w:rFonts w:ascii="Times New Roman" w:cs="Times New Roman" w:eastAsia="Times New Roman" w:hAnsi="Times New Roman"/>
+          <w:color w:val="C00000"/>
           <w:sz w:val="28"/>
           <w:szCs w:val="28"/>
         </w:rPr>
@@ -2136,8 +2360,6 @@
       <w:r>
         <w:rPr>
           <w:rFonts w:ascii="Times New Roman" w:cs="Times New Roman" w:eastAsia="Times New Roman" w:hAnsi="Times New Roman"/>
-          <w:b/>
-          <w:bCs/>
           <w:sz w:val="28"/>
           <w:szCs w:val="28"/>
         </w:rPr>
@@ -2214,7 +2436,16 @@
           <w:sz w:val="28"/>
           <w:szCs w:val="28"/>
         </w:rPr>
-        <w:t xml:space="preserve">- Bên A thực hiện thanh toán 01 lần toàn bộ số tiền hoa hồng của tháng sau khi đã khấu trừ thuế TNCN theo tỷ lệ và điều kiện quy định tại Điều 2, khoản 4 Hợp đồng chính (căn cứ Thông tư số 111/2013/TT-BTC).</w:t>
+        <w:t xml:space="preserve">- Bên A thực hiện thanh toán 01 lần toàn bộ số tiền hoa hồng của tháng sau khi đã khấu trừ thuế TNCN </w:t>
+      </w:r>
+      <w:r>
+        <w:rPr>
+          <w:rFonts w:ascii="Times New Roman" w:cs="Times New Roman" w:eastAsia="Times New Roman" w:hAnsi="Times New Roman"/>
+          <w:color w:val="C00000"/>
+          <w:sz w:val="28"/>
+          <w:szCs w:val="28"/>
+        </w:rPr>
+        <w:t xml:space="preserve">theo tỷ lệ và điều kiện quy định tại Điều 2, khoản 4 Hợp đồng chính (căn cứ Thông tư số 111/2013/TT-BTC).</w:t>
       </w:r>
     </w:p>
     <w:p>
@@ -2347,6 +2578,21 @@
         </w:tc>
       </w:tr>
     </w:tbl>
+    <w:p>
+      <w:pPr>
+        <w:spacing w:before="300"/>
+        <w:jc w:val="both"/>
+      </w:pPr>
+      <w:r>
+        <w:rPr>
+          <w:rFonts w:ascii="Times New Roman" w:cs="Times New Roman" w:eastAsia="Times New Roman" w:hAnsi="Times New Roman"/>
+          <w:color w:val="C00000"/>
+          <w:sz w:val="28"/>
+          <w:szCs w:val="28"/>
+        </w:rPr>
+        <w:t xml:space="preserve">Chú thích: chữ màu đỏ là nội dung mới bổ sung hoặc đã chỉnh sửa so với bản gốc do công ty cung cấp.</w:t>
+      </w:r>
+    </w:p>
     <w:sectPr>
       <w:pgSz w:w="11906" w:h="16838" w:orient="portrait"/>
       <w:pgMar w:top="1440" w:right="1440" w:bottom="1440" w:left="1440" w:header="708" w:footer="708" w:gutter="0"/>

</xml_diff>